<commit_message>
Corregir respaldos reales versionables
</commit_message>
<xml_diff>
--- a/docs/INFORME_EVIDENCIAS_REALES_IDSML.docx
+++ b/docs/INFORME_EVIDENCIAS_REALES_IDSML.docx
@@ -244,17 +244,17 @@
     </w:p>
     <w:p>
       <w:r>
-        <w:t>docs/evidencias/reales/sonarcloud_quality_gate_api_real.json</w:t>
+        <w:t>docs/evidencias/reales/sonarcloud_quality_gate_api_real.txt</w:t>
       </w:r>
     </w:p>
     <w:p>
       <w:r>
-        <w:t>docs/evidencias/reales/sonarcloud_metrics_api_real.json</w:t>
+        <w:t>docs/evidencias/reales/sonarcloud_metrics_api_real.txt</w:t>
       </w:r>
     </w:p>
     <w:p>
       <w:r>
-        <w:t>docs/evidencias/reales/github_actions_latest_run_real.json</w:t>
+        <w:t>docs/evidencias/reales/github_actions_latest_run_real.txt</w:t>
       </w:r>
     </w:p>
     <w:p>

</xml_diff>